<commit_message>
Added new 5.0 version to folder for new version 0.05 board
</commit_message>
<xml_diff>
--- a/Documentation/Mia Operation Manual.docx
+++ b/Documentation/Mia Operation Manual.docx
@@ -1,6 +1,6 @@
 
 <file path=word/document.xml><?xml version="1.0" encoding="utf-8"?>
-<w:document xmlns:wpc="http://schemas.microsoft.com/office/word/2010/wordprocessingCanvas" xmlns:cx="http://schemas.microsoft.com/office/drawing/2014/chartex" xmlns:cx1="http://schemas.microsoft.com/office/drawing/2015/9/8/chartex" xmlns:cx2="http://schemas.microsoft.com/office/drawing/2015/10/21/chartex" xmlns:cx3="http://schemas.microsoft.com/office/drawing/2016/5/9/chartex" xmlns:cx4="http://schemas.microsoft.com/office/drawing/2016/5/10/chartex" xmlns:cx5="http://schemas.microsoft.com/office/drawing/2016/5/11/chartex" xmlns:cx6="http://schemas.microsoft.com/office/drawing/2016/5/12/chartex" xmlns:cx7="http://schemas.microsoft.com/office/drawing/2016/5/13/chartex" xmlns:cx8="http://schemas.microsoft.com/office/drawing/2016/5/14/chartex" xmlns:mc="http://schemas.openxmlformats.org/markup-compatibility/2006" xmlns:aink="http://schemas.microsoft.com/office/drawing/2016/ink" xmlns:am3d="http://schemas.microsoft.com/office/drawing/2017/model3d" xmlns:o="urn:schemas-microsoft-com:office:office" xmlns:oel="http://schemas.microsoft.com/office/2019/extlst" xmlns:r="http://schemas.openxmlformats.org/officeDocument/2006/relationships" xmlns:m="http://schemas.openxmlformats.org/officeDocument/2006/math" xmlns:v="urn:schemas-microsoft-com:vml" xmlns:wp14="http://schemas.microsoft.com/office/word/2010/wordprocessingDrawing" xmlns:wp="http://schemas.openxmlformats.org/drawingml/2006/wordprocessingDrawing" xmlns:w10="urn:schemas-microsoft-com:office:word" xmlns:w="http://schemas.openxmlformats.org/wordprocessingml/2006/main" xmlns:w14="http://schemas.microsoft.com/office/word/2010/wordml" xmlns:w15="http://schemas.microsoft.com/office/word/2012/wordml" xmlns:w16cex="http://schemas.microsoft.com/office/word/2018/wordml/cex" xmlns:w16cid="http://schemas.microsoft.com/office/word/2016/wordml/cid" xmlns:w16="http://schemas.microsoft.com/office/word/2018/wordml" xmlns:w16du="http://schemas.microsoft.com/office/word/2023/wordml/word16du" xmlns:w16sdtdh="http://schemas.microsoft.com/office/word/2020/wordml/sdtdatahash" xmlns:w16sdtfl="http://schemas.microsoft.com/office/word/2024/wordml/sdtformatlock" xmlns:w16se="http://schemas.microsoft.com/office/word/2015/wordml/symex" xmlns:wpg="http://schemas.microsoft.com/office/word/2010/wordprocessingGroup" xmlns:wpi="http://schemas.microsoft.com/office/word/2010/wordprocessingInk" xmlns:wne="http://schemas.microsoft.com/office/word/2006/wordml" xmlns:wps="http://schemas.microsoft.com/office/word/2010/wordprocessingShape" mc:Ignorable="w14 w15 w16se w16cid w16 w16cex w16sdtdh w16sdtfl w16du wp14">
+<w:document xmlns:wpc="http://schemas.microsoft.com/office/word/2010/wordprocessingCanvas" xmlns:cx="http://schemas.microsoft.com/office/drawing/2014/chartex" xmlns:cx1="http://schemas.microsoft.com/office/drawing/2015/9/8/chartex" xmlns:cx2="http://schemas.microsoft.com/office/drawing/2015/10/21/chartex" xmlns:cx3="http://schemas.microsoft.com/office/drawing/2016/5/9/chartex" xmlns:cx4="http://schemas.microsoft.com/office/drawing/2016/5/10/chartex" xmlns:cx5="http://schemas.microsoft.com/office/drawing/2016/5/11/chartex" xmlns:cx6="http://schemas.microsoft.com/office/drawing/2016/5/12/chartex" xmlns:cx7="http://schemas.microsoft.com/office/drawing/2016/5/13/chartex" xmlns:cx8="http://schemas.microsoft.com/office/drawing/2016/5/14/chartex" xmlns:mc="http://schemas.openxmlformats.org/markup-compatibility/2006" xmlns:m="http://schemas.openxmlformats.org/officeDocument/2006/math" xmlns:aink="http://schemas.microsoft.com/office/drawing/2016/ink" xmlns:am3d="http://schemas.microsoft.com/office/drawing/2017/model3d" xmlns:oel="http://schemas.microsoft.com/office/2019/extlst" xmlns:r="http://schemas.openxmlformats.org/officeDocument/2006/relationships" xmlns:wp14="http://schemas.microsoft.com/office/word/2010/wordprocessingDrawing" xmlns:wp="http://schemas.openxmlformats.org/drawingml/2006/wordprocessingDrawing" xmlns:wpg="http://schemas.microsoft.com/office/word/2010/wordprocessingGroup" xmlns:wpi="http://schemas.microsoft.com/office/word/2010/wordprocessingInk" xmlns:wps="http://schemas.microsoft.com/office/word/2010/wordprocessingShape" xmlns:o="urn:schemas-microsoft-com:office:office" xmlns:v="urn:schemas-microsoft-com:vml" xmlns:w10="urn:schemas-microsoft-com:office:word" xmlns:w="http://schemas.openxmlformats.org/wordprocessingml/2006/main" xmlns:w14="http://schemas.microsoft.com/office/word/2010/wordml" xmlns:w15="http://schemas.microsoft.com/office/word/2012/wordml" xmlns:w16cex="http://schemas.microsoft.com/office/word/2018/wordml/cex" xmlns:w16cid="http://schemas.microsoft.com/office/word/2016/wordml/cid" xmlns:w16="http://schemas.microsoft.com/office/word/2018/wordml" xmlns:w16sdtdh="http://schemas.microsoft.com/office/word/2020/wordml/sdtdatahash" xmlns:w16sdtfl="http://schemas.microsoft.com/office/word/2024/wordml/sdtformatlock" xmlns:w16se="http://schemas.microsoft.com/office/word/2015/wordml/symex" xmlns:w16du="http://schemas.microsoft.com/office/word/2023/wordml/word16du" xmlns:wne="http://schemas.microsoft.com/office/word/2006/wordml" mc:Ignorable="w14 w15 w16se w16cid w16 w16cex w16sdtdh w16sdtfl w16du wp14">
   <w:body>
     <w:p>
       <w:pPr>
@@ -3839,27 +3839,7 @@
           <w:sz w:val="11"/>
           <w:szCs w:val="11"/>
         </w:rPr>
-        <w:t xml:space="preserve">                Unused MCU pins must be either an output or an input with a pull up or </w:t>
-      </w:r>
-      <w:proofErr w:type="gramStart"/>
-      <w:r>
-        <w:rPr>
-          <w:rFonts w:ascii="Menlo" w:eastAsia="Times New Roman" w:hAnsi="Menlo" w:cs="Menlo"/>
-          <w:color w:val="95A5A6"/>
-          <w:sz w:val="11"/>
-          <w:szCs w:val="11"/>
-        </w:rPr>
-        <w:t>down</w:t>
-      </w:r>
-      <w:proofErr w:type="gramEnd"/>
-      <w:r>
-        <w:rPr>
-          <w:rFonts w:ascii="Menlo" w:eastAsia="Times New Roman" w:hAnsi="Menlo" w:cs="Menlo"/>
-          <w:color w:val="95A5A6"/>
-          <w:sz w:val="11"/>
-          <w:szCs w:val="11"/>
-        </w:rPr>
-        <w:t xml:space="preserve"> so the pins don't float and draw excess current.</w:t>
+        <w:t xml:space="preserve">                Unused MCU pins must be either an output or an input with a pull up or down so the pins don't float and draw excess current.</w:t>
       </w:r>
     </w:p>
     <w:p>
@@ -4657,6 +4637,7 @@
       </w:pPr>
       <w:r>
         <w:rPr>
+          <w:noProof/>
           <w:sz w:val="21"/>
           <w:szCs w:val="28"/>
         </w:rPr>
@@ -4885,7 +4866,23 @@
           <w:sz w:val="21"/>
           <w:szCs w:val="28"/>
         </w:rPr>
-        <w:t xml:space="preserve"> 50 foam balls and you are </w:t>
+        <w:t xml:space="preserve"> 50 foam </w:t>
+      </w:r>
+      <w:proofErr w:type="gramStart"/>
+      <w:r>
+        <w:rPr>
+          <w:sz w:val="21"/>
+          <w:szCs w:val="28"/>
+        </w:rPr>
+        <w:t>balls</w:t>
+      </w:r>
+      <w:proofErr w:type="gramEnd"/>
+      <w:r>
+        <w:rPr>
+          <w:sz w:val="21"/>
+          <w:szCs w:val="28"/>
+        </w:rPr>
+        <w:t xml:space="preserve"> and you are </w:t>
       </w:r>
       <w:proofErr w:type="spellStart"/>
       <w:r>
@@ -5030,6 +5027,329 @@
           <w:szCs w:val="28"/>
         </w:rPr>
       </w:pPr>
+      <w:r>
+        <w:rPr>
+          <w:sz w:val="21"/>
+          <w:szCs w:val="28"/>
+        </w:rPr>
+        <w:t>Earth’s daily pressure changes:</w:t>
+      </w:r>
+    </w:p>
+    <w:p>
+      <w:pPr>
+        <w:jc w:val="center"/>
+        <w:rPr>
+          <w:sz w:val="21"/>
+          <w:szCs w:val="28"/>
+        </w:rPr>
+      </w:pPr>
+      <w:r>
+        <w:rPr>
+          <w:sz w:val="21"/>
+          <w:szCs w:val="28"/>
+        </w:rPr>
+        <w:drawing>
+          <wp:inline distT="0" distB="0" distL="0" distR="0" wp14:anchorId="0C668E67" wp14:editId="7BA6042B">
+            <wp:extent cx="2667000" cy="2059232"/>
+            <wp:effectExtent l="0" t="0" r="0" b="0"/>
+            <wp:docPr id="1684015057" name="Picture 1"/>
+            <wp:cNvGraphicFramePr>
+              <a:graphicFrameLocks xmlns:a="http://schemas.openxmlformats.org/drawingml/2006/main" noChangeAspect="1"/>
+            </wp:cNvGraphicFramePr>
+            <a:graphic xmlns:a="http://schemas.openxmlformats.org/drawingml/2006/main">
+              <a:graphicData uri="http://schemas.openxmlformats.org/drawingml/2006/picture">
+                <pic:pic xmlns:pic="http://schemas.openxmlformats.org/drawingml/2006/picture">
+                  <pic:nvPicPr>
+                    <pic:cNvPr id="1684015057" name=""/>
+                    <pic:cNvPicPr/>
+                  </pic:nvPicPr>
+                  <pic:blipFill>
+                    <a:blip r:embed="rId11"/>
+                    <a:stretch>
+                      <a:fillRect/>
+                    </a:stretch>
+                  </pic:blipFill>
+                  <pic:spPr>
+                    <a:xfrm>
+                      <a:off x="0" y="0"/>
+                      <a:ext cx="2683963" cy="2072330"/>
+                    </a:xfrm>
+                    <a:prstGeom prst="rect">
+                      <a:avLst/>
+                    </a:prstGeom>
+                  </pic:spPr>
+                </pic:pic>
+              </a:graphicData>
+            </a:graphic>
+          </wp:inline>
+        </w:drawing>
+      </w:r>
+    </w:p>
+    <w:p>
+      <w:pPr>
+        <w:rPr>
+          <w:sz w:val="21"/>
+          <w:szCs w:val="28"/>
+        </w:rPr>
+      </w:pPr>
+      <w:r>
+        <w:rPr>
+          <w:sz w:val="21"/>
+          <w:szCs w:val="28"/>
+        </w:rPr>
+        <w:lastRenderedPageBreak/>
+        <w:t xml:space="preserve">Here is a collection of </w:t>
+      </w:r>
+      <w:proofErr w:type="gramStart"/>
+      <w:r>
+        <w:rPr>
+          <w:sz w:val="21"/>
+          <w:szCs w:val="28"/>
+        </w:rPr>
+        <w:t>high and low pressure</w:t>
+      </w:r>
+      <w:proofErr w:type="gramEnd"/>
+      <w:r>
+        <w:rPr>
+          <w:sz w:val="21"/>
+          <w:szCs w:val="28"/>
+        </w:rPr>
+        <w:t xml:space="preserve"> extremes on earth on May 13, 2026.</w:t>
+      </w:r>
+    </w:p>
+    <w:p>
+      <w:pPr>
+        <w:jc w:val="center"/>
+        <w:rPr>
+          <w:sz w:val="21"/>
+          <w:szCs w:val="28"/>
+        </w:rPr>
+      </w:pPr>
+      <w:r>
+        <w:rPr>
+          <w:sz w:val="21"/>
+          <w:szCs w:val="28"/>
+        </w:rPr>
+        <w:drawing>
+          <wp:inline distT="0" distB="0" distL="0" distR="0" wp14:anchorId="14774EF0" wp14:editId="728A4784">
+            <wp:extent cx="3680460" cy="2356144"/>
+            <wp:effectExtent l="0" t="0" r="2540" b="6350"/>
+            <wp:docPr id="594569273" name="Picture 1"/>
+            <wp:cNvGraphicFramePr>
+              <a:graphicFrameLocks xmlns:a="http://schemas.openxmlformats.org/drawingml/2006/main" noChangeAspect="1"/>
+            </wp:cNvGraphicFramePr>
+            <a:graphic xmlns:a="http://schemas.openxmlformats.org/drawingml/2006/main">
+              <a:graphicData uri="http://schemas.openxmlformats.org/drawingml/2006/picture">
+                <pic:pic xmlns:pic="http://schemas.openxmlformats.org/drawingml/2006/picture">
+                  <pic:nvPicPr>
+                    <pic:cNvPr id="594569273" name=""/>
+                    <pic:cNvPicPr/>
+                  </pic:nvPicPr>
+                  <pic:blipFill>
+                    <a:blip r:embed="rId12"/>
+                    <a:stretch>
+                      <a:fillRect/>
+                    </a:stretch>
+                  </pic:blipFill>
+                  <pic:spPr>
+                    <a:xfrm>
+                      <a:off x="0" y="0"/>
+                      <a:ext cx="3705030" cy="2371873"/>
+                    </a:xfrm>
+                    <a:prstGeom prst="rect">
+                      <a:avLst/>
+                    </a:prstGeom>
+                  </pic:spPr>
+                </pic:pic>
+              </a:graphicData>
+            </a:graphic>
+          </wp:inline>
+        </w:drawing>
+      </w:r>
+    </w:p>
+    <w:p>
+      <w:pPr>
+        <w:rPr>
+          <w:sz w:val="21"/>
+          <w:szCs w:val="28"/>
+        </w:rPr>
+      </w:pPr>
+    </w:p>
+    <w:p>
+      <w:pPr>
+        <w:rPr>
+          <w:sz w:val="21"/>
+          <w:szCs w:val="28"/>
+        </w:rPr>
+      </w:pPr>
+    </w:p>
+    <w:p>
+      <w:pPr>
+        <w:rPr>
+          <w:sz w:val="21"/>
+          <w:szCs w:val="28"/>
+        </w:rPr>
+      </w:pPr>
+      <w:r>
+        <w:rPr>
+          <w:sz w:val="21"/>
+          <w:szCs w:val="28"/>
+        </w:rPr>
+        <w:t>An example of reported altitudes with and without sea level pressure correction.</w:t>
+      </w:r>
+    </w:p>
+    <w:p>
+      <w:pPr>
+        <w:rPr>
+          <w:sz w:val="21"/>
+          <w:szCs w:val="28"/>
+        </w:rPr>
+      </w:pPr>
+    </w:p>
+    <w:p>
+      <w:pPr>
+        <w:rPr>
+          <w:szCs w:val="18"/>
+        </w:rPr>
+      </w:pPr>
+      <w:r>
+        <w:rPr>
+          <w:szCs w:val="18"/>
+        </w:rPr>
+        <w:t xml:space="preserve">    For a city with an elevation of 191 meters, </w:t>
+      </w:r>
+      <w:r>
+        <w:rPr>
+          <w:szCs w:val="18"/>
+        </w:rPr>
+        <w:t>Y</w:t>
+      </w:r>
+      <w:r>
+        <w:rPr>
+          <w:szCs w:val="18"/>
+        </w:rPr>
+        <w:t>psilanti, MI</w:t>
+      </w:r>
+    </w:p>
+    <w:p>
+      <w:pPr>
+        <w:rPr>
+          <w:szCs w:val="18"/>
+        </w:rPr>
+      </w:pPr>
+      <w:r>
+        <w:rPr>
+          <w:szCs w:val="18"/>
+        </w:rPr>
+        <w:t xml:space="preserve">          For a day with a pressure of 15.0 mb below normal</w:t>
+      </w:r>
+    </w:p>
+    <w:p>
+      <w:pPr>
+        <w:rPr>
+          <w:szCs w:val="18"/>
+        </w:rPr>
+      </w:pPr>
+      <w:r>
+        <w:rPr>
+          <w:szCs w:val="18"/>
+        </w:rPr>
+        <w:t xml:space="preserve">            Using uncertainty of a BMP581 sensor,</w:t>
+      </w:r>
+    </w:p>
+    <w:p>
+      <w:pPr>
+        <w:rPr>
+          <w:szCs w:val="18"/>
+        </w:rPr>
+      </w:pPr>
+      <w:r>
+        <w:rPr>
+          <w:szCs w:val="18"/>
+        </w:rPr>
+        <w:t xml:space="preserve">               Apogee altitude above sea level with sea level correction is between 1640.85 meters, </w:t>
+      </w:r>
+      <w:proofErr w:type="gramStart"/>
+      <w:r>
+        <w:rPr>
+          <w:szCs w:val="18"/>
+        </w:rPr>
+        <w:t>and  1641.15</w:t>
+      </w:r>
+      <w:proofErr w:type="gramEnd"/>
+      <w:r>
+        <w:rPr>
+          <w:szCs w:val="18"/>
+        </w:rPr>
+        <w:t xml:space="preserve"> meters.</w:t>
+      </w:r>
+    </w:p>
+    <w:p>
+      <w:pPr>
+        <w:rPr>
+          <w:szCs w:val="18"/>
+        </w:rPr>
+      </w:pPr>
+      <w:r>
+        <w:rPr>
+          <w:szCs w:val="18"/>
+        </w:rPr>
+        <w:t xml:space="preserve">               Apogee altitude above sea level without sea level correction is between 1761.82 meters, </w:t>
+      </w:r>
+      <w:proofErr w:type="gramStart"/>
+      <w:r>
+        <w:rPr>
+          <w:szCs w:val="18"/>
+        </w:rPr>
+        <w:t>and  1762.12</w:t>
+      </w:r>
+      <w:proofErr w:type="gramEnd"/>
+      <w:r>
+        <w:rPr>
+          <w:szCs w:val="18"/>
+        </w:rPr>
+        <w:t xml:space="preserve"> meters.</w:t>
+      </w:r>
+    </w:p>
+    <w:p>
+      <w:pPr>
+        <w:rPr>
+          <w:szCs w:val="18"/>
+        </w:rPr>
+      </w:pPr>
+      <w:r>
+        <w:rPr>
+          <w:szCs w:val="18"/>
+        </w:rPr>
+        <w:t xml:space="preserve">               With sea level correction altitude will be reported between 1449.85 and 1450.15</w:t>
+      </w:r>
+    </w:p>
+    <w:p>
+      <w:pPr>
+        <w:rPr>
+          <w:szCs w:val="18"/>
+        </w:rPr>
+      </w:pPr>
+      <w:r>
+        <w:rPr>
+          <w:szCs w:val="18"/>
+        </w:rPr>
+        <w:t xml:space="preserve">               Without sea level correction altitude will be reported between 1445.74 and 1446.04</w:t>
+      </w:r>
+    </w:p>
+    <w:p>
+      <w:pPr>
+        <w:rPr>
+          <w:szCs w:val="18"/>
+        </w:rPr>
+      </w:pPr>
+    </w:p>
+    <w:p>
+      <w:pPr>
+        <w:rPr>
+          <w:szCs w:val="18"/>
+        </w:rPr>
+      </w:pPr>
     </w:p>
     <w:p>
       <w:pPr>
@@ -5471,7 +5791,7 @@
 </file>
 
 <file path=word/numbering.xml><?xml version="1.0" encoding="utf-8"?>
-<w:numbering xmlns:wpc="http://schemas.microsoft.com/office/word/2010/wordprocessingCanvas" xmlns:cx="http://schemas.microsoft.com/office/drawing/2014/chartex" xmlns:cx1="http://schemas.microsoft.com/office/drawing/2015/9/8/chartex" xmlns:cx2="http://schemas.microsoft.com/office/drawing/2015/10/21/chartex" xmlns:cx3="http://schemas.microsoft.com/office/drawing/2016/5/9/chartex" xmlns:cx4="http://schemas.microsoft.com/office/drawing/2016/5/10/chartex" xmlns:cx5="http://schemas.microsoft.com/office/drawing/2016/5/11/chartex" xmlns:cx6="http://schemas.microsoft.com/office/drawing/2016/5/12/chartex" xmlns:cx7="http://schemas.microsoft.com/office/drawing/2016/5/13/chartex" xmlns:cx8="http://schemas.microsoft.com/office/drawing/2016/5/14/chartex" xmlns:mc="http://schemas.openxmlformats.org/markup-compatibility/2006" xmlns:aink="http://schemas.microsoft.com/office/drawing/2016/ink" xmlns:am3d="http://schemas.microsoft.com/office/drawing/2017/model3d" xmlns:o="urn:schemas-microsoft-com:office:office" xmlns:oel="http://schemas.microsoft.com/office/2019/extlst" xmlns:r="http://schemas.openxmlformats.org/officeDocument/2006/relationships" xmlns:m="http://schemas.openxmlformats.org/officeDocument/2006/math" xmlns:v="urn:schemas-microsoft-com:vml" xmlns:wp14="http://schemas.microsoft.com/office/word/2010/wordprocessingDrawing" xmlns:wp="http://schemas.openxmlformats.org/drawingml/2006/wordprocessingDrawing" xmlns:w10="urn:schemas-microsoft-com:office:word" xmlns:w="http://schemas.openxmlformats.org/wordprocessingml/2006/main" xmlns:w14="http://schemas.microsoft.com/office/word/2010/wordml" xmlns:w15="http://schemas.microsoft.com/office/word/2012/wordml" xmlns:w16cex="http://schemas.microsoft.com/office/word/2018/wordml/cex" xmlns:w16cid="http://schemas.microsoft.com/office/word/2016/wordml/cid" xmlns:w16="http://schemas.microsoft.com/office/word/2018/wordml" xmlns:w16du="http://schemas.microsoft.com/office/word/2023/wordml/word16du" xmlns:w16sdtdh="http://schemas.microsoft.com/office/word/2020/wordml/sdtdatahash" xmlns:w16sdtfl="http://schemas.microsoft.com/office/word/2024/wordml/sdtformatlock" xmlns:w16se="http://schemas.microsoft.com/office/word/2015/wordml/symex" xmlns:wpg="http://schemas.microsoft.com/office/word/2010/wordprocessingGroup" xmlns:wpi="http://schemas.microsoft.com/office/word/2010/wordprocessingInk" xmlns:wne="http://schemas.microsoft.com/office/word/2006/wordml" xmlns:wps="http://schemas.microsoft.com/office/word/2010/wordprocessingShape" mc:Ignorable="w14 w15 w16se w16cid w16 w16cex w16sdtdh w16sdtfl w16du wp14">
+<w:numbering xmlns:wpc="http://schemas.microsoft.com/office/word/2010/wordprocessingCanvas" xmlns:cx="http://schemas.microsoft.com/office/drawing/2014/chartex" xmlns:cx1="http://schemas.microsoft.com/office/drawing/2015/9/8/chartex" xmlns:cx2="http://schemas.microsoft.com/office/drawing/2015/10/21/chartex" xmlns:cx3="http://schemas.microsoft.com/office/drawing/2016/5/9/chartex" xmlns:cx4="http://schemas.microsoft.com/office/drawing/2016/5/10/chartex" xmlns:cx5="http://schemas.microsoft.com/office/drawing/2016/5/11/chartex" xmlns:cx6="http://schemas.microsoft.com/office/drawing/2016/5/12/chartex" xmlns:cx7="http://schemas.microsoft.com/office/drawing/2016/5/13/chartex" xmlns:cx8="http://schemas.microsoft.com/office/drawing/2016/5/14/chartex" xmlns:mc="http://schemas.openxmlformats.org/markup-compatibility/2006" xmlns:m="http://schemas.openxmlformats.org/officeDocument/2006/math" xmlns:aink="http://schemas.microsoft.com/office/drawing/2016/ink" xmlns:am3d="http://schemas.microsoft.com/office/drawing/2017/model3d" xmlns:oel="http://schemas.microsoft.com/office/2019/extlst" xmlns:r="http://schemas.openxmlformats.org/officeDocument/2006/relationships" xmlns:wp14="http://schemas.microsoft.com/office/word/2010/wordprocessingDrawing" xmlns:wp="http://schemas.openxmlformats.org/drawingml/2006/wordprocessingDrawing" xmlns:wpg="http://schemas.microsoft.com/office/word/2010/wordprocessingGroup" xmlns:wpi="http://schemas.microsoft.com/office/word/2010/wordprocessingInk" xmlns:wps="http://schemas.microsoft.com/office/word/2010/wordprocessingShape" xmlns:o="urn:schemas-microsoft-com:office:office" xmlns:v="urn:schemas-microsoft-com:vml" xmlns:w10="urn:schemas-microsoft-com:office:word" xmlns:w="http://schemas.openxmlformats.org/wordprocessingml/2006/main" xmlns:w14="http://schemas.microsoft.com/office/word/2010/wordml" xmlns:w15="http://schemas.microsoft.com/office/word/2012/wordml" xmlns:w16cex="http://schemas.microsoft.com/office/word/2018/wordml/cex" xmlns:w16cid="http://schemas.microsoft.com/office/word/2016/wordml/cid" xmlns:w16="http://schemas.microsoft.com/office/word/2018/wordml" xmlns:w16sdtdh="http://schemas.microsoft.com/office/word/2020/wordml/sdtdatahash" xmlns:w16sdtfl="http://schemas.microsoft.com/office/word/2024/wordml/sdtformatlock" xmlns:w16se="http://schemas.microsoft.com/office/word/2015/wordml/symex" xmlns:w16du="http://schemas.microsoft.com/office/word/2023/wordml/word16du" xmlns:wne="http://schemas.microsoft.com/office/word/2006/wordml" mc:Ignorable="w14 w15 w16se w16cid w16 w16cex w16sdtdh w16sdtfl w16du wp14">
   <w:abstractNum w:abstractNumId="0" w15:restartNumberingAfterBreak="0">
     <w:nsid w:val="09844420"/>
     <w:multiLevelType w:val="hybridMultilevel"/>
@@ -6025,7 +6345,7 @@
 </file>
 
 <file path=word/styles.xml><?xml version="1.0" encoding="utf-8"?>
-<w:styles xmlns:mc="http://schemas.openxmlformats.org/markup-compatibility/2006" xmlns:r="http://schemas.openxmlformats.org/officeDocument/2006/relationships" xmlns:w="http://schemas.openxmlformats.org/wordprocessingml/2006/main" xmlns:w14="http://schemas.microsoft.com/office/word/2010/wordml" xmlns:w15="http://schemas.microsoft.com/office/word/2012/wordml" xmlns:w16cex="http://schemas.microsoft.com/office/word/2018/wordml/cex" xmlns:w16cid="http://schemas.microsoft.com/office/word/2016/wordml/cid" xmlns:w16="http://schemas.microsoft.com/office/word/2018/wordml" xmlns:w16du="http://schemas.microsoft.com/office/word/2023/wordml/word16du" xmlns:w16sdtdh="http://schemas.microsoft.com/office/word/2020/wordml/sdtdatahash" xmlns:w16sdtfl="http://schemas.microsoft.com/office/word/2024/wordml/sdtformatlock" xmlns:w16se="http://schemas.microsoft.com/office/word/2015/wordml/symex" mc:Ignorable="w14 w15 w16se w16cid w16 w16cex w16sdtdh w16sdtfl w16du">
+<w:styles xmlns:mc="http://schemas.openxmlformats.org/markup-compatibility/2006" xmlns:r="http://schemas.openxmlformats.org/officeDocument/2006/relationships" xmlns:w="http://schemas.openxmlformats.org/wordprocessingml/2006/main" xmlns:w14="http://schemas.microsoft.com/office/word/2010/wordml" xmlns:w15="http://schemas.microsoft.com/office/word/2012/wordml" xmlns:w16cex="http://schemas.microsoft.com/office/word/2018/wordml/cex" xmlns:w16cid="http://schemas.microsoft.com/office/word/2016/wordml/cid" xmlns:w16="http://schemas.microsoft.com/office/word/2018/wordml" xmlns:w16sdtdh="http://schemas.microsoft.com/office/word/2020/wordml/sdtdatahash" xmlns:w16sdtfl="http://schemas.microsoft.com/office/word/2024/wordml/sdtformatlock" xmlns:w16se="http://schemas.microsoft.com/office/word/2015/wordml/symex" xmlns:w16du="http://schemas.microsoft.com/office/word/2023/wordml/word16du" mc:Ignorable="w14 w15 w16se w16cid w16 w16cex w16sdtdh w16sdtfl w16du">
   <w:docDefaults>
     <w:rPrDefault>
       <w:rPr>

</xml_diff>